<commit_message>
Fix manje greske u tekstu
</commit_message>
<xml_diff>
--- a/SSU/SSU 7 - Pretraga gotovih racunara.docx
+++ b/SSU/SSU 7 - Pretraga gotovih racunara.docx
@@ -3142,7 +3142,19 @@
         <w:rPr>
           <w:lang w:val="sr-Latn-RS"/>
         </w:rPr>
-        <w:t>Korisnik u tekstualno polje unosi tekst po kom želi da proandje računar</w:t>
+        <w:t>Korisnik u tekstualno polje unosi tekst po kom želi da pro</w:t>
+      </w:r>
+      <w:r>
+        <w:rPr>
+          <w:lang w:val="sr-Latn-RS"/>
+        </w:rPr>
+        <w:t>n</w:t>
+      </w:r>
+      <w:r>
+        <w:rPr>
+          <w:lang w:val="sr-Latn-RS"/>
+        </w:rPr>
+        <w:t>adje računar</w:t>
       </w:r>
     </w:p>
     <w:p>
@@ -3414,7 +3426,13 @@
         <w:rPr>
           <w:lang w:val="sr-Latn-RS"/>
         </w:rPr>
-        <w:t>Korisnik pritiska dugme za pretragu</w:t>
+        <w:t xml:space="preserve">Korisnik pritiska dugme za </w:t>
+      </w:r>
+      <w:r>
+        <w:rPr>
+          <w:lang w:val="sr-Latn-RS"/>
+        </w:rPr>
+        <w:t>filtriranje</w:t>
       </w:r>
     </w:p>
     <w:p>
@@ -3558,7 +3576,7 @@
         </w:numPr>
         <w:rPr>
           <w:rStyle w:val="Heading2Char"/>
-          <w:rFonts w:ascii="Calibri Light" w:eastAsiaTheme="minorHAnsi" w:hAnsi="Calibri Light" w:cstheme="minorBidi"/>
+          <w:rFonts w:asciiTheme="minorHAnsi" w:eastAsiaTheme="minorHAnsi" w:hAnsiTheme="minorHAnsi" w:cstheme="minorHAnsi"/>
           <w:color w:val="auto"/>
           <w:sz w:val="24"/>
           <w:szCs w:val="24"/>
@@ -3568,7 +3586,7 @@
       <w:r>
         <w:rPr>
           <w:rStyle w:val="Heading2Char"/>
-          <w:rFonts w:ascii="Calibri Light" w:eastAsiaTheme="minorHAnsi" w:hAnsi="Calibri Light" w:cstheme="minorBidi"/>
+          <w:rFonts w:asciiTheme="minorHAnsi" w:eastAsiaTheme="minorHAnsi" w:hAnsiTheme="minorHAnsi" w:cstheme="minorHAnsi"/>
           <w:color w:val="auto"/>
           <w:sz w:val="24"/>
           <w:szCs w:val="24"/>
@@ -3586,7 +3604,7 @@
         </w:numPr>
         <w:rPr>
           <w:rStyle w:val="Heading2Char"/>
-          <w:rFonts w:ascii="Calibri Light" w:eastAsiaTheme="minorHAnsi" w:hAnsi="Calibri Light" w:cstheme="minorBidi"/>
+          <w:rFonts w:asciiTheme="minorHAnsi" w:eastAsiaTheme="minorHAnsi" w:hAnsiTheme="minorHAnsi" w:cstheme="minorHAnsi"/>
           <w:color w:val="auto"/>
           <w:sz w:val="24"/>
           <w:szCs w:val="24"/>
@@ -3597,32 +3615,12 @@
       <w:r>
         <w:rPr>
           <w:rStyle w:val="Heading2Char"/>
-          <w:rFonts w:ascii="Calibri Light" w:eastAsiaTheme="minorHAnsi" w:hAnsi="Calibri Light" w:cstheme="minorBidi"/>
+          <w:rFonts w:asciiTheme="minorHAnsi" w:eastAsiaTheme="minorHAnsi" w:hAnsiTheme="minorHAnsi" w:cstheme="minorHAnsi"/>
           <w:color w:val="auto"/>
           <w:sz w:val="24"/>
           <w:szCs w:val="24"/>
         </w:rPr>
-        <w:t xml:space="preserve">Sistem prikazuje opisnu poruku koja govori kisniku da u bazi podataka ne postoje </w:t>
-      </w:r>
-      <w:r>
-        <w:rPr>
-          <w:rStyle w:val="Heading2Char"/>
-          <w:rFonts w:ascii="Calibri Light" w:eastAsiaTheme="minorHAnsi" w:hAnsi="Calibri Light" w:cstheme="minorBidi"/>
-          <w:color w:val="auto"/>
-          <w:sz w:val="24"/>
-          <w:szCs w:val="24"/>
-        </w:rPr>
-        <w:t xml:space="preserve">računari </w:t>
-      </w:r>
-      <w:r>
-        <w:rPr>
-          <w:rStyle w:val="Heading2Char"/>
-          <w:rFonts w:ascii="Calibri Light" w:eastAsiaTheme="minorHAnsi" w:hAnsi="Calibri Light" w:cstheme="minorBidi"/>
-          <w:color w:val="auto"/>
-          <w:sz w:val="24"/>
-          <w:szCs w:val="24"/>
-        </w:rPr>
-        <w:t>koje ispunjavaju zadate kriterijume.</w:t>
+        <w:t>Sistem prikazuje opisnu poruku koja govori kisniku da u bazi podataka ne postoje računari koje ispunjavaju zadate kriterijume.</w:t>
       </w:r>
       <w:bookmarkEnd w:id="19"/>
       <w:bookmarkEnd w:id="20"/>
@@ -3705,7 +3703,31 @@
           <w:szCs w:val="24"/>
           <w:u w:val="single"/>
         </w:rPr>
-        <w:t>nakn uspešne pretrage se odlučuje za pregled računara</w:t>
+        <w:t>nak</w:t>
+      </w:r>
+      <w:r>
+        <w:rPr>
+          <w:rStyle w:val="Heading3Char"/>
+          <w:b/>
+          <w:bCs/>
+          <w:color w:val="auto"/>
+          <w:sz w:val="24"/>
+          <w:szCs w:val="24"/>
+          <w:u w:val="single"/>
+        </w:rPr>
+        <w:t>o</w:t>
+      </w:r>
+      <w:r>
+        <w:rPr>
+          <w:rStyle w:val="Heading3Char"/>
+          <w:b/>
+          <w:bCs/>
+          <w:color w:val="auto"/>
+          <w:sz w:val="24"/>
+          <w:szCs w:val="24"/>
+          <w:u w:val="single"/>
+        </w:rPr>
+        <w:t>n uspešne pretrage se odlučuje za pregled računara</w:t>
       </w:r>
       <w:bookmarkEnd w:id="21"/>
     </w:p>
@@ -3742,7 +3764,7 @@
         <w:rPr>
           <w:lang w:val="sr-Latn-RS"/>
         </w:rPr>
-        <w:t>Klikom na nekog od računara korisniku se otvara nov prozor u kom mu se prikayzuju sve informacije o tom računaru (opis,banchmark rezultati,komponente, cena,....)</w:t>
+        <w:t>Klikom na nekog od računara korisniku se otvara nov prozor u kom mu se prikazuju sve informacije o tom računaru (opis,banchmark rezultati,komponente, cena,....)</w:t>
       </w:r>
     </w:p>
     <w:p>

</xml_diff>